<commit_message>
fix(contracts): PAG día 14→56, VAL perfil B $6k→$9.6k+10 tickets, TSR renumber empty clauses
- CMU-PAG cl. segunda: 'décimo cuarto (14°)' → 'quincuagésimo sexto (56°) — semana 8'
  con referencia cruzada explícita a TSR cl. segunda inciso d). Riesgo crítico: si
  un comprador no pagaba al día 14, CMU técnicamente podía ejecutar el pagaré
  mientras el TSR le daba hasta el día 56.
- CMU-VAL cl. segunda b) Perfil B: '$6,000/mes' → '$9,600/mes + 10 tickets último mes'
  para alinear con el motor CMU en producción.
- CMU-TSR: dos 'CLÁUSULA . — .' vacías se renumeraron como:
    SÉPTIMA BIS — REGLAS OPERATIVAS DEL FONDO DE GARANTÍA
    NOVENA BIS — EFECTOS DE LA RESCISIÓN
</commit_message>
<xml_diff>
--- a/cmu-decision/server/templates/CMU-TSR.docx
+++ b/cmu-decision/server/templates/CMU-TSR.docx
@@ -1661,20 +1661,20 @@
           <w:sz w:val="22"/>
           <w:szCs w:val="22"/>
         </w:rPr>
-        <w:t xml:space="preserve">CLÁUSULA . — </w:t>
-      </w:r>
-      <w:r>
-        <w:rPr>
-          <w:rFonts w:ascii="Arial" w:cs="Arial" w:eastAsia="Arial" w:hAnsi="Arial"/>
-          <w:b/>
-          <w:bCs/>
-          <w:i w:val="false"/>
-          <w:iCs w:val="false"/>
-          <w:color w:val="000000"/>
-          <w:sz w:val="22"/>
-          <w:szCs w:val="22"/>
-        </w:rPr>
-        <w:t xml:space="preserve"> . </w:t>
+        <w:t xml:space="preserve">CLÁUSULA SÉPTIMA BIS. — </w:t>
+      </w:r>
+      <w:r>
+        <w:rPr>
+          <w:rFonts w:ascii="Arial" w:cs="Arial" w:eastAsia="Arial" w:hAnsi="Arial"/>
+          <w:b/>
+          <w:bCs/>
+          <w:i w:val="false"/>
+          <w:iCs w:val="false"/>
+          <w:color w:val="000000"/>
+          <w:sz w:val="22"/>
+          <w:szCs w:val="22"/>
+        </w:rPr>
+        <w:t xml:space="preserve">REGLAS OPERATIVAS DEL FONDO DE GARANTÍA.</w:t>
       </w:r>
       <w:r>
         <w:rPr>
@@ -2390,20 +2390,20 @@
           <w:sz w:val="22"/>
           <w:szCs w:val="22"/>
         </w:rPr>
-        <w:t xml:space="preserve">CLÁUSULA . — </w:t>
-      </w:r>
-      <w:r>
-        <w:rPr>
-          <w:rFonts w:ascii="Arial" w:cs="Arial" w:eastAsia="Arial" w:hAnsi="Arial"/>
-          <w:b/>
-          <w:bCs/>
-          <w:i w:val="false"/>
-          <w:iCs w:val="false"/>
-          <w:color w:val="000000"/>
-          <w:sz w:val="22"/>
-          <w:szCs w:val="22"/>
-        </w:rPr>
-        <w:t xml:space="preserve">. </w:t>
+        <w:t xml:space="preserve">CLÁUSULA NOVENA BIS. — </w:t>
+      </w:r>
+      <w:r>
+        <w:rPr>
+          <w:rFonts w:ascii="Arial" w:cs="Arial" w:eastAsia="Arial" w:hAnsi="Arial"/>
+          <w:b/>
+          <w:bCs/>
+          <w:i w:val="false"/>
+          <w:iCs w:val="false"/>
+          <w:color w:val="000000"/>
+          <w:sz w:val="22"/>
+          <w:szCs w:val="22"/>
+        </w:rPr>
+        <w:t xml:space="preserve">EFECTOS DE LA RESCISIÓN.</w:t>
       </w:r>
       <w:r>
         <w:rPr>

</xml_diff>